<commit_message>
docs: update academic project report for Sahil Moghaiz (RA2311028010062), 21CSE463T, Dr. S. Prabakeran
</commit_message>
<xml_diff>
--- a/Attendance_System_VibeCoding_Project_Report.docx
+++ b/Attendance_System_VibeCoding_Project_Report.docx
@@ -37,7 +37,8 @@
           <w:sz w:val="26"/>
           <w:szCs w:val="26"/>
         </w:rPr>
-        <w:t xml:space="preserve">21CSP302L - PROJECT</w:t>
+        <w:t xml:space="preserve">21CSE463T - CLOUD STRATEGY PLANNING AND MANAGEMENT
+PROJECT REPORT</w:t>
       </w:r>
     </w:p>
     <w:p>
@@ -61,7 +62,7 @@
     </w:p>
     <w:p>
       <w:pPr>
-        <w:spacing w:after="200" w:before="80" w:line="276"/>
+        <w:spacing w:after="220" w:before="80" w:line="276"/>
         <w:jc w:val="center"/>
       </w:pPr>
       <w:r>
@@ -72,12 +73,10 @@
           <w:i w:val="false"/>
           <w:iCs w:val="false"/>
           <w:color w:val="222222"/>
-          <w:sz w:val="26"/>
-          <w:szCs w:val="26"/>
+          <w:sz w:val="28"/>
+          <w:szCs w:val="28"/>
         </w:rPr>
-        <w:t xml:space="preserve">Sahil Moghaiz [RA2311028010062]
-Tanmay Shrivastava [RA2311028010082]
-Nishchal Mahant [RA2311028010077]</w:t>
+        <w:t xml:space="preserve">Sahil Moghaiz [RA2311028010062]</w:t>
       </w:r>
     </w:p>
     <w:p>
@@ -101,7 +100,7 @@
     </w:p>
     <w:p>
       <w:pPr>
-        <w:spacing w:after="200" w:before="80" w:line="276"/>
+        <w:spacing w:after="220" w:before="80" w:line="276"/>
         <w:jc w:val="center"/>
       </w:pPr>
       <w:r>
@@ -115,8 +114,8 @@
           <w:sz w:val="26"/>
           <w:szCs w:val="26"/>
         </w:rPr>
-        <w:t xml:space="preserve">Dr S Benisha
-Assistant Professor</w:t>
+        <w:t xml:space="preserve">Dr. S. Prabakeran
+Professor</w:t>
       </w:r>
     </w:p>
     <w:p>
@@ -375,7 +374,7 @@
                 <w:sz w:val="21"/>
                 <w:szCs w:val="21"/>
               </w:rPr>
-              <w:t xml:space="preserve">B.TECH. CSE CLOUD COMPUTING (21CSP302L)</w:t>
+              <w:t xml:space="preserve">B.TECH. CSE CLOUD COMPUTING</w:t>
             </w:r>
           </w:p>
         </w:tc>
@@ -405,35 +404,35 @@
                 <w:sz w:val="21"/>
                 <w:szCs w:val="21"/>
               </w:rPr>
-              <w:t xml:space="preserve">Student Names</w:t>
-            </w:r>
-          </w:p>
-        </w:tc>
-        <w:tc>
-          <w:tcPr>
-            <w:tcBorders>
-              <w:top w:val="single" w:color="CCCCCC" w:sz="2"/>
-              <w:left w:val="single" w:color="CCCCCC" w:sz="2"/>
-              <w:bottom w:val="single" w:color="CCCCCC" w:sz="2"/>
-              <w:right w:val="single" w:color="CCCCCC" w:sz="2"/>
-            </w:tcBorders>
-            <w:shd w:fill="F7FAFC" w:val="clear"/>
-            <w:tcMar>
-              <w:top w:type="dxa" w:w="100"/>
-              <w:left w:type="dxa" w:w="140"/>
-              <w:bottom w:type="dxa" w:w="100"/>
-              <w:right w:type="dxa" w:w="140"/>
-            </w:tcMar>
-          </w:tcPr>
-          <w:p>
-            <w:r>
-              <w:rPr>
-                <w:rFonts w:ascii="Times New Roman" w:cs="Times New Roman" w:eastAsia="Times New Roman" w:hAnsi="Times New Roman"/>
-                <w:color w:val="222222"/>
-                <w:sz w:val="21"/>
-                <w:szCs w:val="21"/>
-              </w:rPr>
-              <w:t xml:space="preserve">Sahil Moghaiz, Tanmay Shrivastava, Nishchal Mahant</w:t>
+              <w:t xml:space="preserve">Subject &amp; Code</w:t>
+            </w:r>
+          </w:p>
+        </w:tc>
+        <w:tc>
+          <w:tcPr>
+            <w:tcBorders>
+              <w:top w:val="single" w:color="CCCCCC" w:sz="2"/>
+              <w:left w:val="single" w:color="CCCCCC" w:sz="2"/>
+              <w:bottom w:val="single" w:color="CCCCCC" w:sz="2"/>
+              <w:right w:val="single" w:color="CCCCCC" w:sz="2"/>
+            </w:tcBorders>
+            <w:shd w:fill="F7FAFC" w:val="clear"/>
+            <w:tcMar>
+              <w:top w:type="dxa" w:w="100"/>
+              <w:left w:type="dxa" w:w="140"/>
+              <w:bottom w:type="dxa" w:w="100"/>
+              <w:right w:type="dxa" w:w="140"/>
+            </w:tcMar>
+          </w:tcPr>
+          <w:p>
+            <w:r>
+              <w:rPr>
+                <w:rFonts w:ascii="Times New Roman" w:cs="Times New Roman" w:eastAsia="Times New Roman" w:hAnsi="Times New Roman"/>
+                <w:color w:val="222222"/>
+                <w:sz w:val="21"/>
+                <w:szCs w:val="21"/>
+              </w:rPr>
+              <w:t xml:space="preserve">Cloud Strategy Planning and Management (21CSE463T)</w:t>
             </w:r>
           </w:p>
         </w:tc>
@@ -463,35 +462,35 @@
                 <w:sz w:val="21"/>
                 <w:szCs w:val="21"/>
               </w:rPr>
-              <w:t xml:space="preserve">Registration Numbers</w:t>
-            </w:r>
-          </w:p>
-        </w:tc>
-        <w:tc>
-          <w:tcPr>
-            <w:tcBorders>
-              <w:top w:val="single" w:color="CCCCCC" w:sz="2"/>
-              <w:left w:val="single" w:color="CCCCCC" w:sz="2"/>
-              <w:bottom w:val="single" w:color="CCCCCC" w:sz="2"/>
-              <w:right w:val="single" w:color="CCCCCC" w:sz="2"/>
-            </w:tcBorders>
-            <w:shd w:fill="FFFFFF" w:val="clear"/>
-            <w:tcMar>
-              <w:top w:type="dxa" w:w="100"/>
-              <w:left w:type="dxa" w:w="140"/>
-              <w:bottom w:type="dxa" w:w="100"/>
-              <w:right w:type="dxa" w:w="140"/>
-            </w:tcMar>
-          </w:tcPr>
-          <w:p>
-            <w:r>
-              <w:rPr>
-                <w:rFonts w:ascii="Times New Roman" w:cs="Times New Roman" w:eastAsia="Times New Roman" w:hAnsi="Times New Roman"/>
-                <w:color w:val="222222"/>
-                <w:sz w:val="21"/>
-                <w:szCs w:val="21"/>
-              </w:rPr>
-              <w:t xml:space="preserve">RA2311028010062, RA2311028010082, RA2311028010077</w:t>
+              <w:t xml:space="preserve">Student Name</w:t>
+            </w:r>
+          </w:p>
+        </w:tc>
+        <w:tc>
+          <w:tcPr>
+            <w:tcBorders>
+              <w:top w:val="single" w:color="CCCCCC" w:sz="2"/>
+              <w:left w:val="single" w:color="CCCCCC" w:sz="2"/>
+              <w:bottom w:val="single" w:color="CCCCCC" w:sz="2"/>
+              <w:right w:val="single" w:color="CCCCCC" w:sz="2"/>
+            </w:tcBorders>
+            <w:shd w:fill="FFFFFF" w:val="clear"/>
+            <w:tcMar>
+              <w:top w:type="dxa" w:w="100"/>
+              <w:left w:type="dxa" w:w="140"/>
+              <w:bottom w:type="dxa" w:w="100"/>
+              <w:right w:type="dxa" w:w="140"/>
+            </w:tcMar>
+          </w:tcPr>
+          <w:p>
+            <w:r>
+              <w:rPr>
+                <w:rFonts w:ascii="Times New Roman" w:cs="Times New Roman" w:eastAsia="Times New Roman" w:hAnsi="Times New Roman"/>
+                <w:color w:val="222222"/>
+                <w:sz w:val="21"/>
+                <w:szCs w:val="21"/>
+              </w:rPr>
+              <w:t xml:space="preserve">Sahil Moghaiz</w:t>
             </w:r>
           </w:p>
         </w:tc>
@@ -521,6 +520,64 @@
                 <w:sz w:val="21"/>
                 <w:szCs w:val="21"/>
               </w:rPr>
+              <w:t xml:space="preserve">Registration Number</w:t>
+            </w:r>
+          </w:p>
+        </w:tc>
+        <w:tc>
+          <w:tcPr>
+            <w:tcBorders>
+              <w:top w:val="single" w:color="CCCCCC" w:sz="2"/>
+              <w:left w:val="single" w:color="CCCCCC" w:sz="2"/>
+              <w:bottom w:val="single" w:color="CCCCCC" w:sz="2"/>
+              <w:right w:val="single" w:color="CCCCCC" w:sz="2"/>
+            </w:tcBorders>
+            <w:shd w:fill="F7FAFC" w:val="clear"/>
+            <w:tcMar>
+              <w:top w:type="dxa" w:w="100"/>
+              <w:left w:type="dxa" w:w="140"/>
+              <w:bottom w:type="dxa" w:w="100"/>
+              <w:right w:type="dxa" w:w="140"/>
+            </w:tcMar>
+          </w:tcPr>
+          <w:p>
+            <w:r>
+              <w:rPr>
+                <w:rFonts w:ascii="Times New Roman" w:cs="Times New Roman" w:eastAsia="Times New Roman" w:hAnsi="Times New Roman"/>
+                <w:color w:val="222222"/>
+                <w:sz w:val="21"/>
+                <w:szCs w:val="21"/>
+              </w:rPr>
+              <w:t xml:space="preserve">RA2311028010062</w:t>
+            </w:r>
+          </w:p>
+        </w:tc>
+      </w:tr>
+      <w:tr>
+        <w:tc>
+          <w:tcPr>
+            <w:tcBorders>
+              <w:top w:val="single" w:color="CCCCCC" w:sz="2"/>
+              <w:left w:val="single" w:color="CCCCCC" w:sz="2"/>
+              <w:bottom w:val="single" w:color="CCCCCC" w:sz="2"/>
+              <w:right w:val="single" w:color="CCCCCC" w:sz="2"/>
+            </w:tcBorders>
+            <w:shd w:fill="FFFFFF" w:val="clear"/>
+            <w:tcMar>
+              <w:top w:type="dxa" w:w="100"/>
+              <w:left w:type="dxa" w:w="140"/>
+              <w:bottom w:type="dxa" w:w="100"/>
+              <w:right w:type="dxa" w:w="140"/>
+            </w:tcMar>
+          </w:tcPr>
+          <w:p>
+            <w:r>
+              <w:rPr>
+                <w:rFonts w:ascii="Times New Roman" w:cs="Times New Roman" w:eastAsia="Times New Roman" w:hAnsi="Times New Roman"/>
+                <w:color w:val="222222"/>
+                <w:sz w:val="21"/>
+                <w:szCs w:val="21"/>
+              </w:rPr>
               <w:t xml:space="preserve">Title of Work</w:t>
             </w:r>
           </w:p>
@@ -533,7 +590,7 @@
               <w:bottom w:val="single" w:color="CCCCCC" w:sz="2"/>
               <w:right w:val="single" w:color="CCCCCC" w:sz="2"/>
             </w:tcBorders>
-            <w:shd w:fill="F7FAFC" w:val="clear"/>
+            <w:shd w:fill="FFFFFF" w:val="clear"/>
             <w:tcMar>
               <w:top w:type="dxa" w:w="100"/>
               <w:left w:type="dxa" w:w="140"/>
@@ -571,7 +628,7 @@
           <w:sz w:val="22"/>
           <w:szCs w:val="22"/>
         </w:rPr>
-        <w:t xml:space="preserve">We hereby certify that this assessment complies with the University’s Rules and Regulations relating to Academic misconduct and plagiarism, as listed in the University Website, Regulations, and the Education Committee guidelines.</w:t>
+        <w:t xml:space="preserve">I hereby certify that this assessment complies with the University’s Rules and Regulations relating to Academic misconduct and plagiarism, as listed in the University Website, Regulations, and the Education Committee guidelines.</w:t>
       </w:r>
     </w:p>
     <w:p>
@@ -590,7 +647,7 @@
           <w:sz w:val="22"/>
           <w:szCs w:val="22"/>
         </w:rPr>
-        <w:t xml:space="preserve">We confirm that all the work contained in this assessment is our own except where indicated, and that We have met the following conditions:</w:t>
+        <w:t xml:space="preserve">I confirm that all the work contained in this assessment is my own except where indicated, and that I have met the following conditions:</w:t>
       </w:r>
     </w:p>
     <w:p>
@@ -628,7 +685,7 @@
           <w:sz w:val="24"/>
           <w:szCs w:val="24"/>
         </w:rPr>
-        <w:t xml:space="preserve">Referenced and put in quotation marks all quoted text (from documentation, papers, etc.)</w:t>
+        <w:t xml:space="preserve">Referenced and put in quotation marks all quoted text (from documentation, research papers, etc.)</w:t>
       </w:r>
     </w:p>
     <w:p>
@@ -685,7 +742,7 @@
           <w:sz w:val="24"/>
           <w:szCs w:val="24"/>
         </w:rPr>
-        <w:t xml:space="preserve">Acknowledged in appropriate places any help that I have received from others (supervisors, external sources)</w:t>
+        <w:t xml:space="preserve">Acknowledged in appropriate places any help that I have received from others (supervisor, external sources)</w:t>
       </w:r>
     </w:p>
     <w:p>
@@ -785,7 +842,7 @@
                 <w:sz w:val="22"/>
                 <w:szCs w:val="22"/>
               </w:rPr>
-              <w:t xml:space="preserve">I am aware of and understand the University’s policy on Academic misconduct and plagiarism and I certify that this assessment is my / our own work, except where indicated by referring, and that I have followed the good academic practices noted above.</w:t>
+              <w:t xml:space="preserve">I am aware of and understand the University’s policy on Academic misconduct and plagiarism and I certify that this assessment is my own work, except where indicated by referring, and that I have followed the good academic practices noted above.</w:t>
             </w:r>
           </w:p>
           <w:p>
@@ -813,7 +870,7 @@
                 <w:sz w:val="22"/>
                 <w:szCs w:val="22"/>
               </w:rPr>
-              <w:t xml:space="preserve">Sahil Moghaiz (RA2311028010062)          Tanmay Shrivastava (RA2311028010082)          Nishchal Mahant (RA2311028010077)</w:t>
+              <w:t xml:space="preserve">Student Signature: _______________________          Name: Sahil Moghaiz [RA2311028010062]</w:t>
             </w:r>
           </w:p>
           <w:p>
@@ -893,7 +950,7 @@
           <w:sz w:val="24"/>
           <w:szCs w:val="24"/>
         </w:rPr>
-        <w:t xml:space="preserve">Certified that 21CSP302L - Project report titled “Presently: An AWS Serverless AI Facial Recognition Attendance and Classroom Management Platform for Higher Education” is the bonafide work of “Sahil Moghaiz [RA2311028010062], Tanmay Shrivastava [RA2311028010082], Nishchal Mahant [RA2311028010077]” who carried out the project work under my supervision. Certified further, that to the best of my knowledge the work reported herein does not form any other project report or dissertation on the basis of which a degree or award was conferred on an earlier occasion on this or any other candidate.</w:t>
+        <w:t xml:space="preserve">Certified that the 21CSE463T - Project report titled “Presently: An AWS Serverless AI Facial Recognition Attendance and Classroom Management Platform for Higher Education” is the bonafide work of “Sahil Moghaiz [RA2311028010062]” who carried out the project work under my supervision for the course Cloud Strategy Planning and Management. Certified further, that to the best of my knowledge the work reported herein does not form any other project report or dissertation on the basis of which a degree or award was conferred on an earlier occasion on this or any other candidate.</w:t>
       </w:r>
     </w:p>
     <w:tbl>
@@ -939,7 +996,7 @@
                 <w:sz w:val="22"/>
                 <w:szCs w:val="22"/>
               </w:rPr>
-              <w:t xml:space="preserve">Supervisor</w:t>
+              <w:t xml:space="preserve">Supervisor / Faculty In-Charge</w:t>
             </w:r>
           </w:p>
         </w:tc>
@@ -996,9 +1053,9 @@
                 <w:sz w:val="21"/>
                 <w:szCs w:val="21"/>
               </w:rPr>
-              <w:t xml:space="preserve">Dr. S Benisha
+              <w:t xml:space="preserve">Dr. S. Prabakeran
 SUPERVISOR
-Assistant Professor
+Professor
 DEPARTMENT OF NETWORKING AND COMMUNICATION</w:t>
             </w:r>
           </w:p>
@@ -1230,7 +1287,7 @@
           <w:sz w:val="24"/>
           <w:szCs w:val="24"/>
         </w:rPr>
-        <w:t xml:space="preserve">We express our humble gratitude to Dr. C. Muthamizhchelvan, Vice-Chancellor, SRM Institute of Science and Technology, for the facilities extended for the project work and his continued support.</w:t>
+        <w:t xml:space="preserve">I express my humble gratitude to Dr. C. Muthamizhchelvan, Vice-Chancellor, SRM Institute of Science and Technology, for the facilities extended for the project work and his continued support.</w:t>
       </w:r>
     </w:p>
     <w:p>
@@ -1249,7 +1306,7 @@
           <w:sz w:val="24"/>
           <w:szCs w:val="24"/>
         </w:rPr>
-        <w:t xml:space="preserve">We extend our sincere thanks to Dr. Leenus Jesu Martin M, Dean-CET, SRM Institute of Science and Technology, for his invaluable support.</w:t>
+        <w:t xml:space="preserve">I extend my sincere thanks to Dr. Leenus Jesu Martin M, Dean-CET, SRM Institute of Science and Technology, for his invaluable support.</w:t>
       </w:r>
     </w:p>
     <w:p>
@@ -1268,7 +1325,7 @@
           <w:sz w:val="24"/>
           <w:szCs w:val="24"/>
         </w:rPr>
-        <w:t xml:space="preserve">We wish to thank Dr. Revathi Venkataraman, Professor and Chairperson, School of Computing, SRM Institute of Science and Technology, for her support throughout the project work.</w:t>
+        <w:t xml:space="preserve">I wish to thank Dr. Revathi Venkataraman, Professor and Chairperson, School of Computing, SRM Institute of Science and Technology, for her support throughout the project work.</w:t>
       </w:r>
     </w:p>
     <w:p>
@@ -1287,7 +1344,7 @@
           <w:sz w:val="24"/>
           <w:szCs w:val="24"/>
         </w:rPr>
-        <w:t xml:space="preserve">We encompass our sincere thanks to Dr. M. Pushpalatha, Professor and Associate Chairperson - CS, and Dr. C. Lakshmi, Professor and Associate Chairperson - AI, School of Computing, SRM Institute of Science and Technology, for their invaluable support.</w:t>
+        <w:t xml:space="preserve">I encompass my sincere thanks to Dr. M. Pushpalatha, Professor and Associate Chairperson - CS, and Dr. C. Lakshmi, Professor and Associate Chairperson - AI, School of Computing, SRM Institute of Science and Technology, for their invaluable support.</w:t>
       </w:r>
     </w:p>
     <w:p>
@@ -1306,7 +1363,7 @@
           <w:sz w:val="24"/>
           <w:szCs w:val="24"/>
         </w:rPr>
-        <w:t xml:space="preserve">We are incredibly grateful to our Head of the Department, Dr. M. Lakshmi, Department of Networking and Communications, SRM Institute of Science and Technology, for her suggestions and encouragement at all the stages of the project work.</w:t>
+        <w:t xml:space="preserve">I am incredibly grateful to our Head of the Department, Dr. M. Lakshmi, Department of Networking and Communications, SRM Institute of Science and Technology, for her suggestions and encouragement at all the stages of the project work.</w:t>
       </w:r>
     </w:p>
     <w:p>
@@ -1325,7 +1382,7 @@
           <w:sz w:val="24"/>
           <w:szCs w:val="24"/>
         </w:rPr>
-        <w:t xml:space="preserve">We register our immeasurable thanks to our Faculty Advisor, Dr. Lakshmi Dhevi B, Department of Networking and Communications, SRM Institute of Science and Technology, for leading and helping us to complete our course.</w:t>
+        <w:t xml:space="preserve">I register my immeasurable thanks to our Faculty Advisor, Dr. Lakshmi Dhevi B, Department of Networking and Communications, SRM Institute of Science and Technology, for leading and helping me to complete my course.</w:t>
       </w:r>
     </w:p>
     <w:p>
@@ -1344,7 +1401,7 @@
           <w:sz w:val="24"/>
           <w:szCs w:val="24"/>
         </w:rPr>
-        <w:t xml:space="preserve">Our inexpressible respect and thanks to our guide, Dr. S. Benisha, Department of Networking and Communications, SRM Institute of Science and Technology, for providing us with an opportunity to pursue our project under her mentorship. Her passion for solving problems and making a difference in the cloud computing domain has always been inspiring.</w:t>
+        <w:t xml:space="preserve">My inexpressible respect and deepest gratitude to my guide, Dr. S. Prabakeran, Professor, Department of Networking and Communications, SRM Institute of Science and Technology, for providing me with an opportunity to pursue my project under his mentorship in Cloud Strategy Planning and Management (21CSE463T). His passion for cloud architectural design, serverless systems, and problem-solving has always been inspiring.</w:t>
       </w:r>
     </w:p>
     <w:p>
@@ -1363,7 +1420,7 @@
           <w:sz w:val="24"/>
           <w:szCs w:val="24"/>
         </w:rPr>
-        <w:t xml:space="preserve">Finally, we would like to thank our parents, family members, and friends for their unconditional love, constant support, and encouragement.</w:t>
+        <w:t xml:space="preserve">Finally, I would like to thank my parents, family members, and friends for their unconditional love, constant support, and encouragement.</w:t>
       </w:r>
     </w:p>
     <w:p>
@@ -1379,12 +1436,10 @@
           <w:i w:val="false"/>
           <w:iCs w:val="false"/>
           <w:color w:val="222222"/>
-          <w:sz w:val="24"/>
-          <w:szCs w:val="24"/>
+          <w:sz w:val="26"/>
+          <w:szCs w:val="26"/>
         </w:rPr>
-        <w:t xml:space="preserve">Sahil Moghaiz [RA2311028010062]
-Tanmay Shrivastava [RA2311028010082]
-Nishchal Mahant [RA2311028010077]</w:t>
+        <w:t xml:space="preserve">Sahil Moghaiz [RA2311028010062]</w:t>
       </w:r>
     </w:p>
     <w:p>
@@ -1427,7 +1482,7 @@
           <w:sz w:val="24"/>
           <w:szCs w:val="24"/>
         </w:rPr>
-        <w:t xml:space="preserve">The Presently system is an AI-driven, cloud-native facial recognition attendance and classroom management platform designed specifically for higher education institutions. The primary objective is to deliver an automated, proxy-proof biometric attendance tracking mechanism paired with master timetable scheduling and automated faculty notifications, completely operating within AWS Free Tier infrastructure provisioned via Terraform.</w:t>
+        <w:t xml:space="preserve">The Presently system is an AI-driven, cloud-native facial recognition attendance and classroom management platform designed specifically for higher education institutions. Submitted as the core project requirement for Cloud Strategy Planning and Management (21CSE463T), the primary objective is to deliver an automated, proxy-proof biometric attendance tracking mechanism paired with master timetable scheduling and automated faculty notifications, completely operating within AWS Free Tier infrastructure provisioned via Terraform.</w:t>
       </w:r>
     </w:p>
     <w:p>
@@ -1484,7 +1539,7 @@
           <w:sz w:val="22"/>
           <w:szCs w:val="22"/>
         </w:rPr>
-        <w:t xml:space="preserve">Index Terms—Biometric Attendance, Facial Recognition, Amazon Rekognition, AWS Lambda, DynamoDB, Serverless Computing, Amazon Cognito, CloudFront, Terraform, Higher Education, Node.js, Python.</w:t>
+        <w:t xml:space="preserve">Index Terms—Cloud Strategy, Biometric Attendance, Facial Recognition, Amazon Rekognition, AWS Lambda, DynamoDB, Serverless Computing, Amazon Cognito, CloudFront, Terraform, 21CSE463T, Node.js, Python.</w:t>
       </w:r>
     </w:p>
     <w:p>
@@ -2269,7 +2324,7 @@
                 <w:sz w:val="21"/>
                 <w:szCs w:val="21"/>
               </w:rPr>
-              <w:t xml:space="preserve">Motivation</w:t>
+              <w:t xml:space="preserve">Motivation &amp; Cloud Strategy Alignment</w:t>
             </w:r>
           </w:p>
         </w:tc>
@@ -6829,35 +6884,35 @@
                 <w:sz w:val="21"/>
                 <w:szCs w:val="21"/>
               </w:rPr>
-              <w:t xml:space="preserve">DDB</w:t>
-            </w:r>
-          </w:p>
-        </w:tc>
-        <w:tc>
-          <w:tcPr>
-            <w:tcBorders>
-              <w:top w:val="single" w:color="CCCCCC" w:sz="2"/>
-              <w:left w:val="single" w:color="CCCCCC" w:sz="2"/>
-              <w:bottom w:val="single" w:color="CCCCCC" w:sz="2"/>
-              <w:right w:val="single" w:color="CCCCCC" w:sz="2"/>
-            </w:tcBorders>
-            <w:shd w:fill="FFFFFF" w:val="clear"/>
-            <w:tcMar>
-              <w:top w:type="dxa" w:w="100"/>
-              <w:left w:type="dxa" w:w="140"/>
-              <w:bottom w:type="dxa" w:w="100"/>
-              <w:right w:type="dxa" w:w="140"/>
-            </w:tcMar>
-          </w:tcPr>
-          <w:p>
-            <w:r>
-              <w:rPr>
-                <w:rFonts w:ascii="Times New Roman" w:cs="Times New Roman" w:eastAsia="Times New Roman" w:hAnsi="Times New Roman"/>
-                <w:color w:val="222222"/>
-                <w:sz w:val="21"/>
-                <w:szCs w:val="21"/>
-              </w:rPr>
-              <w:t xml:space="preserve">Amazon DynamoDB (NoSQL Database)</w:t>
+              <w:t xml:space="preserve">CSPM</w:t>
+            </w:r>
+          </w:p>
+        </w:tc>
+        <w:tc>
+          <w:tcPr>
+            <w:tcBorders>
+              <w:top w:val="single" w:color="CCCCCC" w:sz="2"/>
+              <w:left w:val="single" w:color="CCCCCC" w:sz="2"/>
+              <w:bottom w:val="single" w:color="CCCCCC" w:sz="2"/>
+              <w:right w:val="single" w:color="CCCCCC" w:sz="2"/>
+            </w:tcBorders>
+            <w:shd w:fill="FFFFFF" w:val="clear"/>
+            <w:tcMar>
+              <w:top w:type="dxa" w:w="100"/>
+              <w:left w:type="dxa" w:w="140"/>
+              <w:bottom w:type="dxa" w:w="100"/>
+              <w:right w:type="dxa" w:w="140"/>
+            </w:tcMar>
+          </w:tcPr>
+          <w:p>
+            <w:r>
+              <w:rPr>
+                <w:rFonts w:ascii="Times New Roman" w:cs="Times New Roman" w:eastAsia="Times New Roman" w:hAnsi="Times New Roman"/>
+                <w:color w:val="222222"/>
+                <w:sz w:val="21"/>
+                <w:szCs w:val="21"/>
+              </w:rPr>
+              <w:t xml:space="preserve">Cloud Strategy Planning and Management (21CSE463T)</w:t>
             </w:r>
           </w:p>
         </w:tc>
@@ -6887,35 +6942,35 @@
                 <w:sz w:val="21"/>
                 <w:szCs w:val="21"/>
               </w:rPr>
-              <w:t xml:space="preserve">HTML5</w:t>
-            </w:r>
-          </w:p>
-        </w:tc>
-        <w:tc>
-          <w:tcPr>
-            <w:tcBorders>
-              <w:top w:val="single" w:color="CCCCCC" w:sz="2"/>
-              <w:left w:val="single" w:color="CCCCCC" w:sz="2"/>
-              <w:bottom w:val="single" w:color="CCCCCC" w:sz="2"/>
-              <w:right w:val="single" w:color="CCCCCC" w:sz="2"/>
-            </w:tcBorders>
-            <w:shd w:fill="F7FAFC" w:val="clear"/>
-            <w:tcMar>
-              <w:top w:type="dxa" w:w="100"/>
-              <w:left w:type="dxa" w:w="140"/>
-              <w:bottom w:type="dxa" w:w="100"/>
-              <w:right w:type="dxa" w:w="140"/>
-            </w:tcMar>
-          </w:tcPr>
-          <w:p>
-            <w:r>
-              <w:rPr>
-                <w:rFonts w:ascii="Times New Roman" w:cs="Times New Roman" w:eastAsia="Times New Roman" w:hAnsi="Times New Roman"/>
-                <w:color w:val="222222"/>
-                <w:sz w:val="21"/>
-                <w:szCs w:val="21"/>
-              </w:rPr>
-              <w:t xml:space="preserve">HyperText Markup Language 5</w:t>
+              <w:t xml:space="preserve">DDB</w:t>
+            </w:r>
+          </w:p>
+        </w:tc>
+        <w:tc>
+          <w:tcPr>
+            <w:tcBorders>
+              <w:top w:val="single" w:color="CCCCCC" w:sz="2"/>
+              <w:left w:val="single" w:color="CCCCCC" w:sz="2"/>
+              <w:bottom w:val="single" w:color="CCCCCC" w:sz="2"/>
+              <w:right w:val="single" w:color="CCCCCC" w:sz="2"/>
+            </w:tcBorders>
+            <w:shd w:fill="F7FAFC" w:val="clear"/>
+            <w:tcMar>
+              <w:top w:type="dxa" w:w="100"/>
+              <w:left w:type="dxa" w:w="140"/>
+              <w:bottom w:type="dxa" w:w="100"/>
+              <w:right w:type="dxa" w:w="140"/>
+            </w:tcMar>
+          </w:tcPr>
+          <w:p>
+            <w:r>
+              <w:rPr>
+                <w:rFonts w:ascii="Times New Roman" w:cs="Times New Roman" w:eastAsia="Times New Roman" w:hAnsi="Times New Roman"/>
+                <w:color w:val="222222"/>
+                <w:sz w:val="21"/>
+                <w:szCs w:val="21"/>
+              </w:rPr>
+              <w:t xml:space="preserve">Amazon DynamoDB (NoSQL Database)</w:t>
             </w:r>
           </w:p>
         </w:tc>
@@ -6945,35 +7000,35 @@
                 <w:sz w:val="21"/>
                 <w:szCs w:val="21"/>
               </w:rPr>
-              <w:t xml:space="preserve">HTTPS</w:t>
-            </w:r>
-          </w:p>
-        </w:tc>
-        <w:tc>
-          <w:tcPr>
-            <w:tcBorders>
-              <w:top w:val="single" w:color="CCCCCC" w:sz="2"/>
-              <w:left w:val="single" w:color="CCCCCC" w:sz="2"/>
-              <w:bottom w:val="single" w:color="CCCCCC" w:sz="2"/>
-              <w:right w:val="single" w:color="CCCCCC" w:sz="2"/>
-            </w:tcBorders>
-            <w:shd w:fill="FFFFFF" w:val="clear"/>
-            <w:tcMar>
-              <w:top w:type="dxa" w:w="100"/>
-              <w:left w:type="dxa" w:w="140"/>
-              <w:bottom w:type="dxa" w:w="100"/>
-              <w:right w:type="dxa" w:w="140"/>
-            </w:tcMar>
-          </w:tcPr>
-          <w:p>
-            <w:r>
-              <w:rPr>
-                <w:rFonts w:ascii="Times New Roman" w:cs="Times New Roman" w:eastAsia="Times New Roman" w:hAnsi="Times New Roman"/>
-                <w:color w:val="222222"/>
-                <w:sz w:val="21"/>
-                <w:szCs w:val="21"/>
-              </w:rPr>
-              <w:t xml:space="preserve">Hypertext Transfer Protocol Secure</w:t>
+              <w:t xml:space="preserve">HTML5</w:t>
+            </w:r>
+          </w:p>
+        </w:tc>
+        <w:tc>
+          <w:tcPr>
+            <w:tcBorders>
+              <w:top w:val="single" w:color="CCCCCC" w:sz="2"/>
+              <w:left w:val="single" w:color="CCCCCC" w:sz="2"/>
+              <w:bottom w:val="single" w:color="CCCCCC" w:sz="2"/>
+              <w:right w:val="single" w:color="CCCCCC" w:sz="2"/>
+            </w:tcBorders>
+            <w:shd w:fill="FFFFFF" w:val="clear"/>
+            <w:tcMar>
+              <w:top w:type="dxa" w:w="100"/>
+              <w:left w:type="dxa" w:w="140"/>
+              <w:bottom w:type="dxa" w:w="100"/>
+              <w:right w:type="dxa" w:w="140"/>
+            </w:tcMar>
+          </w:tcPr>
+          <w:p>
+            <w:r>
+              <w:rPr>
+                <w:rFonts w:ascii="Times New Roman" w:cs="Times New Roman" w:eastAsia="Times New Roman" w:hAnsi="Times New Roman"/>
+                <w:color w:val="222222"/>
+                <w:sz w:val="21"/>
+                <w:szCs w:val="21"/>
+              </w:rPr>
+              <w:t xml:space="preserve">HyperText Markup Language 5</w:t>
             </w:r>
           </w:p>
         </w:tc>
@@ -7003,35 +7058,35 @@
                 <w:sz w:val="21"/>
                 <w:szCs w:val="21"/>
               </w:rPr>
-              <w:t xml:space="preserve">IaC</w:t>
-            </w:r>
-          </w:p>
-        </w:tc>
-        <w:tc>
-          <w:tcPr>
-            <w:tcBorders>
-              <w:top w:val="single" w:color="CCCCCC" w:sz="2"/>
-              <w:left w:val="single" w:color="CCCCCC" w:sz="2"/>
-              <w:bottom w:val="single" w:color="CCCCCC" w:sz="2"/>
-              <w:right w:val="single" w:color="CCCCCC" w:sz="2"/>
-            </w:tcBorders>
-            <w:shd w:fill="F7FAFC" w:val="clear"/>
-            <w:tcMar>
-              <w:top w:type="dxa" w:w="100"/>
-              <w:left w:type="dxa" w:w="140"/>
-              <w:bottom w:type="dxa" w:w="100"/>
-              <w:right w:type="dxa" w:w="140"/>
-            </w:tcMar>
-          </w:tcPr>
-          <w:p>
-            <w:r>
-              <w:rPr>
-                <w:rFonts w:ascii="Times New Roman" w:cs="Times New Roman" w:eastAsia="Times New Roman" w:hAnsi="Times New Roman"/>
-                <w:color w:val="222222"/>
-                <w:sz w:val="21"/>
-                <w:szCs w:val="21"/>
-              </w:rPr>
-              <w:t xml:space="preserve">Infrastructure as Code (Terraform)</w:t>
+              <w:t xml:space="preserve">HTTPS</w:t>
+            </w:r>
+          </w:p>
+        </w:tc>
+        <w:tc>
+          <w:tcPr>
+            <w:tcBorders>
+              <w:top w:val="single" w:color="CCCCCC" w:sz="2"/>
+              <w:left w:val="single" w:color="CCCCCC" w:sz="2"/>
+              <w:bottom w:val="single" w:color="CCCCCC" w:sz="2"/>
+              <w:right w:val="single" w:color="CCCCCC" w:sz="2"/>
+            </w:tcBorders>
+            <w:shd w:fill="F7FAFC" w:val="clear"/>
+            <w:tcMar>
+              <w:top w:type="dxa" w:w="100"/>
+              <w:left w:type="dxa" w:w="140"/>
+              <w:bottom w:type="dxa" w:w="100"/>
+              <w:right w:type="dxa" w:w="140"/>
+            </w:tcMar>
+          </w:tcPr>
+          <w:p>
+            <w:r>
+              <w:rPr>
+                <w:rFonts w:ascii="Times New Roman" w:cs="Times New Roman" w:eastAsia="Times New Roman" w:hAnsi="Times New Roman"/>
+                <w:color w:val="222222"/>
+                <w:sz w:val="21"/>
+                <w:szCs w:val="21"/>
+              </w:rPr>
+              <w:t xml:space="preserve">Hypertext Transfer Protocol Secure</w:t>
             </w:r>
           </w:p>
         </w:tc>
@@ -7061,35 +7116,35 @@
                 <w:sz w:val="21"/>
                 <w:szCs w:val="21"/>
               </w:rPr>
-              <w:t xml:space="preserve">IAM</w:t>
-            </w:r>
-          </w:p>
-        </w:tc>
-        <w:tc>
-          <w:tcPr>
-            <w:tcBorders>
-              <w:top w:val="single" w:color="CCCCCC" w:sz="2"/>
-              <w:left w:val="single" w:color="CCCCCC" w:sz="2"/>
-              <w:bottom w:val="single" w:color="CCCCCC" w:sz="2"/>
-              <w:right w:val="single" w:color="CCCCCC" w:sz="2"/>
-            </w:tcBorders>
-            <w:shd w:fill="FFFFFF" w:val="clear"/>
-            <w:tcMar>
-              <w:top w:type="dxa" w:w="100"/>
-              <w:left w:type="dxa" w:w="140"/>
-              <w:bottom w:type="dxa" w:w="100"/>
-              <w:right w:type="dxa" w:w="140"/>
-            </w:tcMar>
-          </w:tcPr>
-          <w:p>
-            <w:r>
-              <w:rPr>
-                <w:rFonts w:ascii="Times New Roman" w:cs="Times New Roman" w:eastAsia="Times New Roman" w:hAnsi="Times New Roman"/>
-                <w:color w:val="222222"/>
-                <w:sz w:val="21"/>
-                <w:szCs w:val="21"/>
-              </w:rPr>
-              <w:t xml:space="preserve">Identity and Access Management</w:t>
+              <w:t xml:space="preserve">IaC</w:t>
+            </w:r>
+          </w:p>
+        </w:tc>
+        <w:tc>
+          <w:tcPr>
+            <w:tcBorders>
+              <w:top w:val="single" w:color="CCCCCC" w:sz="2"/>
+              <w:left w:val="single" w:color="CCCCCC" w:sz="2"/>
+              <w:bottom w:val="single" w:color="CCCCCC" w:sz="2"/>
+              <w:right w:val="single" w:color="CCCCCC" w:sz="2"/>
+            </w:tcBorders>
+            <w:shd w:fill="FFFFFF" w:val="clear"/>
+            <w:tcMar>
+              <w:top w:type="dxa" w:w="100"/>
+              <w:left w:type="dxa" w:w="140"/>
+              <w:bottom w:type="dxa" w:w="100"/>
+              <w:right w:type="dxa" w:w="140"/>
+            </w:tcMar>
+          </w:tcPr>
+          <w:p>
+            <w:r>
+              <w:rPr>
+                <w:rFonts w:ascii="Times New Roman" w:cs="Times New Roman" w:eastAsia="Times New Roman" w:hAnsi="Times New Roman"/>
+                <w:color w:val="222222"/>
+                <w:sz w:val="21"/>
+                <w:szCs w:val="21"/>
+              </w:rPr>
+              <w:t xml:space="preserve">Infrastructure as Code (Terraform)</w:t>
             </w:r>
           </w:p>
         </w:tc>
@@ -7119,35 +7174,35 @@
                 <w:sz w:val="21"/>
                 <w:szCs w:val="21"/>
               </w:rPr>
-              <w:t xml:space="preserve">JSON</w:t>
-            </w:r>
-          </w:p>
-        </w:tc>
-        <w:tc>
-          <w:tcPr>
-            <w:tcBorders>
-              <w:top w:val="single" w:color="CCCCCC" w:sz="2"/>
-              <w:left w:val="single" w:color="CCCCCC" w:sz="2"/>
-              <w:bottom w:val="single" w:color="CCCCCC" w:sz="2"/>
-              <w:right w:val="single" w:color="CCCCCC" w:sz="2"/>
-            </w:tcBorders>
-            <w:shd w:fill="F7FAFC" w:val="clear"/>
-            <w:tcMar>
-              <w:top w:type="dxa" w:w="100"/>
-              <w:left w:type="dxa" w:w="140"/>
-              <w:bottom w:type="dxa" w:w="100"/>
-              <w:right w:type="dxa" w:w="140"/>
-            </w:tcMar>
-          </w:tcPr>
-          <w:p>
-            <w:r>
-              <w:rPr>
-                <w:rFonts w:ascii="Times New Roman" w:cs="Times New Roman" w:eastAsia="Times New Roman" w:hAnsi="Times New Roman"/>
-                <w:color w:val="222222"/>
-                <w:sz w:val="21"/>
-                <w:szCs w:val="21"/>
-              </w:rPr>
-              <w:t xml:space="preserve">JavaScript Object Notation</w:t>
+              <w:t xml:space="preserve">IAM</w:t>
+            </w:r>
+          </w:p>
+        </w:tc>
+        <w:tc>
+          <w:tcPr>
+            <w:tcBorders>
+              <w:top w:val="single" w:color="CCCCCC" w:sz="2"/>
+              <w:left w:val="single" w:color="CCCCCC" w:sz="2"/>
+              <w:bottom w:val="single" w:color="CCCCCC" w:sz="2"/>
+              <w:right w:val="single" w:color="CCCCCC" w:sz="2"/>
+            </w:tcBorders>
+            <w:shd w:fill="F7FAFC" w:val="clear"/>
+            <w:tcMar>
+              <w:top w:type="dxa" w:w="100"/>
+              <w:left w:type="dxa" w:w="140"/>
+              <w:bottom w:type="dxa" w:w="100"/>
+              <w:right w:type="dxa" w:w="140"/>
+            </w:tcMar>
+          </w:tcPr>
+          <w:p>
+            <w:r>
+              <w:rPr>
+                <w:rFonts w:ascii="Times New Roman" w:cs="Times New Roman" w:eastAsia="Times New Roman" w:hAnsi="Times New Roman"/>
+                <w:color w:val="222222"/>
+                <w:sz w:val="21"/>
+                <w:szCs w:val="21"/>
+              </w:rPr>
+              <w:t xml:space="preserve">Identity and Access Management</w:t>
             </w:r>
           </w:p>
         </w:tc>
@@ -7177,35 +7232,35 @@
                 <w:sz w:val="21"/>
                 <w:szCs w:val="21"/>
               </w:rPr>
-              <w:t xml:space="preserve">JWT</w:t>
-            </w:r>
-          </w:p>
-        </w:tc>
-        <w:tc>
-          <w:tcPr>
-            <w:tcBorders>
-              <w:top w:val="single" w:color="CCCCCC" w:sz="2"/>
-              <w:left w:val="single" w:color="CCCCCC" w:sz="2"/>
-              <w:bottom w:val="single" w:color="CCCCCC" w:sz="2"/>
-              <w:right w:val="single" w:color="CCCCCC" w:sz="2"/>
-            </w:tcBorders>
-            <w:shd w:fill="FFFFFF" w:val="clear"/>
-            <w:tcMar>
-              <w:top w:type="dxa" w:w="100"/>
-              <w:left w:type="dxa" w:w="140"/>
-              <w:bottom w:type="dxa" w:w="100"/>
-              <w:right w:type="dxa" w:w="140"/>
-            </w:tcMar>
-          </w:tcPr>
-          <w:p>
-            <w:r>
-              <w:rPr>
-                <w:rFonts w:ascii="Times New Roman" w:cs="Times New Roman" w:eastAsia="Times New Roman" w:hAnsi="Times New Roman"/>
-                <w:color w:val="222222"/>
-                <w:sz w:val="21"/>
-                <w:szCs w:val="21"/>
-              </w:rPr>
-              <w:t xml:space="preserve">JSON Web Token</w:t>
+              <w:t xml:space="preserve">JSON</w:t>
+            </w:r>
+          </w:p>
+        </w:tc>
+        <w:tc>
+          <w:tcPr>
+            <w:tcBorders>
+              <w:top w:val="single" w:color="CCCCCC" w:sz="2"/>
+              <w:left w:val="single" w:color="CCCCCC" w:sz="2"/>
+              <w:bottom w:val="single" w:color="CCCCCC" w:sz="2"/>
+              <w:right w:val="single" w:color="CCCCCC" w:sz="2"/>
+            </w:tcBorders>
+            <w:shd w:fill="FFFFFF" w:val="clear"/>
+            <w:tcMar>
+              <w:top w:type="dxa" w:w="100"/>
+              <w:left w:type="dxa" w:w="140"/>
+              <w:bottom w:type="dxa" w:w="100"/>
+              <w:right w:type="dxa" w:w="140"/>
+            </w:tcMar>
+          </w:tcPr>
+          <w:p>
+            <w:r>
+              <w:rPr>
+                <w:rFonts w:ascii="Times New Roman" w:cs="Times New Roman" w:eastAsia="Times New Roman" w:hAnsi="Times New Roman"/>
+                <w:color w:val="222222"/>
+                <w:sz w:val="21"/>
+                <w:szCs w:val="21"/>
+              </w:rPr>
+              <w:t xml:space="preserve">JavaScript Object Notation</w:t>
             </w:r>
           </w:p>
         </w:tc>
@@ -7235,35 +7290,35 @@
                 <w:sz w:val="21"/>
                 <w:szCs w:val="21"/>
               </w:rPr>
-              <w:t xml:space="preserve">NoSQL</w:t>
-            </w:r>
-          </w:p>
-        </w:tc>
-        <w:tc>
-          <w:tcPr>
-            <w:tcBorders>
-              <w:top w:val="single" w:color="CCCCCC" w:sz="2"/>
-              <w:left w:val="single" w:color="CCCCCC" w:sz="2"/>
-              <w:bottom w:val="single" w:color="CCCCCC" w:sz="2"/>
-              <w:right w:val="single" w:color="CCCCCC" w:sz="2"/>
-            </w:tcBorders>
-            <w:shd w:fill="F7FAFC" w:val="clear"/>
-            <w:tcMar>
-              <w:top w:type="dxa" w:w="100"/>
-              <w:left w:type="dxa" w:w="140"/>
-              <w:bottom w:type="dxa" w:w="100"/>
-              <w:right w:type="dxa" w:w="140"/>
-            </w:tcMar>
-          </w:tcPr>
-          <w:p>
-            <w:r>
-              <w:rPr>
-                <w:rFonts w:ascii="Times New Roman" w:cs="Times New Roman" w:eastAsia="Times New Roman" w:hAnsi="Times New Roman"/>
-                <w:color w:val="222222"/>
-                <w:sz w:val="21"/>
-                <w:szCs w:val="21"/>
-              </w:rPr>
-              <w:t xml:space="preserve">Non-Relational Database</w:t>
+              <w:t xml:space="preserve">JWT</w:t>
+            </w:r>
+          </w:p>
+        </w:tc>
+        <w:tc>
+          <w:tcPr>
+            <w:tcBorders>
+              <w:top w:val="single" w:color="CCCCCC" w:sz="2"/>
+              <w:left w:val="single" w:color="CCCCCC" w:sz="2"/>
+              <w:bottom w:val="single" w:color="CCCCCC" w:sz="2"/>
+              <w:right w:val="single" w:color="CCCCCC" w:sz="2"/>
+            </w:tcBorders>
+            <w:shd w:fill="F7FAFC" w:val="clear"/>
+            <w:tcMar>
+              <w:top w:type="dxa" w:w="100"/>
+              <w:left w:type="dxa" w:w="140"/>
+              <w:bottom w:type="dxa" w:w="100"/>
+              <w:right w:type="dxa" w:w="140"/>
+            </w:tcMar>
+          </w:tcPr>
+          <w:p>
+            <w:r>
+              <w:rPr>
+                <w:rFonts w:ascii="Times New Roman" w:cs="Times New Roman" w:eastAsia="Times New Roman" w:hAnsi="Times New Roman"/>
+                <w:color w:val="222222"/>
+                <w:sz w:val="21"/>
+                <w:szCs w:val="21"/>
+              </w:rPr>
+              <w:t xml:space="preserve">JSON Web Token</w:t>
             </w:r>
           </w:p>
         </w:tc>
@@ -7293,35 +7348,35 @@
                 <w:sz w:val="21"/>
                 <w:szCs w:val="21"/>
               </w:rPr>
-              <w:t xml:space="preserve">RBAC</w:t>
-            </w:r>
-          </w:p>
-        </w:tc>
-        <w:tc>
-          <w:tcPr>
-            <w:tcBorders>
-              <w:top w:val="single" w:color="CCCCCC" w:sz="2"/>
-              <w:left w:val="single" w:color="CCCCCC" w:sz="2"/>
-              <w:bottom w:val="single" w:color="CCCCCC" w:sz="2"/>
-              <w:right w:val="single" w:color="CCCCCC" w:sz="2"/>
-            </w:tcBorders>
-            <w:shd w:fill="FFFFFF" w:val="clear"/>
-            <w:tcMar>
-              <w:top w:type="dxa" w:w="100"/>
-              <w:left w:type="dxa" w:w="140"/>
-              <w:bottom w:type="dxa" w:w="100"/>
-              <w:right w:type="dxa" w:w="140"/>
-            </w:tcMar>
-          </w:tcPr>
-          <w:p>
-            <w:r>
-              <w:rPr>
-                <w:rFonts w:ascii="Times New Roman" w:cs="Times New Roman" w:eastAsia="Times New Roman" w:hAnsi="Times New Roman"/>
-                <w:color w:val="222222"/>
-                <w:sz w:val="21"/>
-                <w:szCs w:val="21"/>
-              </w:rPr>
-              <w:t xml:space="preserve">Role-Based Access Control</w:t>
+              <w:t xml:space="preserve">NoSQL</w:t>
+            </w:r>
+          </w:p>
+        </w:tc>
+        <w:tc>
+          <w:tcPr>
+            <w:tcBorders>
+              <w:top w:val="single" w:color="CCCCCC" w:sz="2"/>
+              <w:left w:val="single" w:color="CCCCCC" w:sz="2"/>
+              <w:bottom w:val="single" w:color="CCCCCC" w:sz="2"/>
+              <w:right w:val="single" w:color="CCCCCC" w:sz="2"/>
+            </w:tcBorders>
+            <w:shd w:fill="FFFFFF" w:val="clear"/>
+            <w:tcMar>
+              <w:top w:type="dxa" w:w="100"/>
+              <w:left w:type="dxa" w:w="140"/>
+              <w:bottom w:type="dxa" w:w="100"/>
+              <w:right w:type="dxa" w:w="140"/>
+            </w:tcMar>
+          </w:tcPr>
+          <w:p>
+            <w:r>
+              <w:rPr>
+                <w:rFonts w:ascii="Times New Roman" w:cs="Times New Roman" w:eastAsia="Times New Roman" w:hAnsi="Times New Roman"/>
+                <w:color w:val="222222"/>
+                <w:sz w:val="21"/>
+                <w:szCs w:val="21"/>
+              </w:rPr>
+              <w:t xml:space="preserve">Non-Relational Database</w:t>
             </w:r>
           </w:p>
         </w:tc>
@@ -7351,35 +7406,35 @@
                 <w:sz w:val="21"/>
                 <w:szCs w:val="21"/>
               </w:rPr>
-              <w:t xml:space="preserve">REST</w:t>
-            </w:r>
-          </w:p>
-        </w:tc>
-        <w:tc>
-          <w:tcPr>
-            <w:tcBorders>
-              <w:top w:val="single" w:color="CCCCCC" w:sz="2"/>
-              <w:left w:val="single" w:color="CCCCCC" w:sz="2"/>
-              <w:bottom w:val="single" w:color="CCCCCC" w:sz="2"/>
-              <w:right w:val="single" w:color="CCCCCC" w:sz="2"/>
-            </w:tcBorders>
-            <w:shd w:fill="F7FAFC" w:val="clear"/>
-            <w:tcMar>
-              <w:top w:type="dxa" w:w="100"/>
-              <w:left w:type="dxa" w:w="140"/>
-              <w:bottom w:type="dxa" w:w="100"/>
-              <w:right w:type="dxa" w:w="140"/>
-            </w:tcMar>
-          </w:tcPr>
-          <w:p>
-            <w:r>
-              <w:rPr>
-                <w:rFonts w:ascii="Times New Roman" w:cs="Times New Roman" w:eastAsia="Times New Roman" w:hAnsi="Times New Roman"/>
-                <w:color w:val="222222"/>
-                <w:sz w:val="21"/>
-                <w:szCs w:val="21"/>
-              </w:rPr>
-              <w:t xml:space="preserve">Representational State Transfer</w:t>
+              <w:t xml:space="preserve">RBAC</w:t>
+            </w:r>
+          </w:p>
+        </w:tc>
+        <w:tc>
+          <w:tcPr>
+            <w:tcBorders>
+              <w:top w:val="single" w:color="CCCCCC" w:sz="2"/>
+              <w:left w:val="single" w:color="CCCCCC" w:sz="2"/>
+              <w:bottom w:val="single" w:color="CCCCCC" w:sz="2"/>
+              <w:right w:val="single" w:color="CCCCCC" w:sz="2"/>
+            </w:tcBorders>
+            <w:shd w:fill="F7FAFC" w:val="clear"/>
+            <w:tcMar>
+              <w:top w:type="dxa" w:w="100"/>
+              <w:left w:type="dxa" w:w="140"/>
+              <w:bottom w:type="dxa" w:w="100"/>
+              <w:right w:type="dxa" w:w="140"/>
+            </w:tcMar>
+          </w:tcPr>
+          <w:p>
+            <w:r>
+              <w:rPr>
+                <w:rFonts w:ascii="Times New Roman" w:cs="Times New Roman" w:eastAsia="Times New Roman" w:hAnsi="Times New Roman"/>
+                <w:color w:val="222222"/>
+                <w:sz w:val="21"/>
+                <w:szCs w:val="21"/>
+              </w:rPr>
+              <w:t xml:space="preserve">Role-Based Access Control</w:t>
             </w:r>
           </w:p>
         </w:tc>
@@ -7409,35 +7464,35 @@
                 <w:sz w:val="21"/>
                 <w:szCs w:val="21"/>
               </w:rPr>
-              <w:t xml:space="preserve">S3</w:t>
-            </w:r>
-          </w:p>
-        </w:tc>
-        <w:tc>
-          <w:tcPr>
-            <w:tcBorders>
-              <w:top w:val="single" w:color="CCCCCC" w:sz="2"/>
-              <w:left w:val="single" w:color="CCCCCC" w:sz="2"/>
-              <w:bottom w:val="single" w:color="CCCCCC" w:sz="2"/>
-              <w:right w:val="single" w:color="CCCCCC" w:sz="2"/>
-            </w:tcBorders>
-            <w:shd w:fill="FFFFFF" w:val="clear"/>
-            <w:tcMar>
-              <w:top w:type="dxa" w:w="100"/>
-              <w:left w:type="dxa" w:w="140"/>
-              <w:bottom w:type="dxa" w:w="100"/>
-              <w:right w:type="dxa" w:w="140"/>
-            </w:tcMar>
-          </w:tcPr>
-          <w:p>
-            <w:r>
-              <w:rPr>
-                <w:rFonts w:ascii="Times New Roman" w:cs="Times New Roman" w:eastAsia="Times New Roman" w:hAnsi="Times New Roman"/>
-                <w:color w:val="222222"/>
-                <w:sz w:val="21"/>
-                <w:szCs w:val="21"/>
-              </w:rPr>
-              <w:t xml:space="preserve">Amazon Simple Storage Service</w:t>
+              <w:t xml:space="preserve">REST</w:t>
+            </w:r>
+          </w:p>
+        </w:tc>
+        <w:tc>
+          <w:tcPr>
+            <w:tcBorders>
+              <w:top w:val="single" w:color="CCCCCC" w:sz="2"/>
+              <w:left w:val="single" w:color="CCCCCC" w:sz="2"/>
+              <w:bottom w:val="single" w:color="CCCCCC" w:sz="2"/>
+              <w:right w:val="single" w:color="CCCCCC" w:sz="2"/>
+            </w:tcBorders>
+            <w:shd w:fill="FFFFFF" w:val="clear"/>
+            <w:tcMar>
+              <w:top w:type="dxa" w:w="100"/>
+              <w:left w:type="dxa" w:w="140"/>
+              <w:bottom w:type="dxa" w:w="100"/>
+              <w:right w:type="dxa" w:w="140"/>
+            </w:tcMar>
+          </w:tcPr>
+          <w:p>
+            <w:r>
+              <w:rPr>
+                <w:rFonts w:ascii="Times New Roman" w:cs="Times New Roman" w:eastAsia="Times New Roman" w:hAnsi="Times New Roman"/>
+                <w:color w:val="222222"/>
+                <w:sz w:val="21"/>
+                <w:szCs w:val="21"/>
+              </w:rPr>
+              <w:t xml:space="preserve">Representational State Transfer</w:t>
             </w:r>
           </w:p>
         </w:tc>
@@ -7467,35 +7522,35 @@
                 <w:sz w:val="21"/>
                 <w:szCs w:val="21"/>
               </w:rPr>
-              <w:t xml:space="preserve">SDG</w:t>
-            </w:r>
-          </w:p>
-        </w:tc>
-        <w:tc>
-          <w:tcPr>
-            <w:tcBorders>
-              <w:top w:val="single" w:color="CCCCCC" w:sz="2"/>
-              <w:left w:val="single" w:color="CCCCCC" w:sz="2"/>
-              <w:bottom w:val="single" w:color="CCCCCC" w:sz="2"/>
-              <w:right w:val="single" w:color="CCCCCC" w:sz="2"/>
-            </w:tcBorders>
-            <w:shd w:fill="F7FAFC" w:val="clear"/>
-            <w:tcMar>
-              <w:top w:type="dxa" w:w="100"/>
-              <w:left w:type="dxa" w:w="140"/>
-              <w:bottom w:type="dxa" w:w="100"/>
-              <w:right w:type="dxa" w:w="140"/>
-            </w:tcMar>
-          </w:tcPr>
-          <w:p>
-            <w:r>
-              <w:rPr>
-                <w:rFonts w:ascii="Times New Roman" w:cs="Times New Roman" w:eastAsia="Times New Roman" w:hAnsi="Times New Roman"/>
-                <w:color w:val="222222"/>
-                <w:sz w:val="21"/>
-                <w:szCs w:val="21"/>
-              </w:rPr>
-              <w:t xml:space="preserve">Sustainable Development Goal</w:t>
+              <w:t xml:space="preserve">S3</w:t>
+            </w:r>
+          </w:p>
+        </w:tc>
+        <w:tc>
+          <w:tcPr>
+            <w:tcBorders>
+              <w:top w:val="single" w:color="CCCCCC" w:sz="2"/>
+              <w:left w:val="single" w:color="CCCCCC" w:sz="2"/>
+              <w:bottom w:val="single" w:color="CCCCCC" w:sz="2"/>
+              <w:right w:val="single" w:color="CCCCCC" w:sz="2"/>
+            </w:tcBorders>
+            <w:shd w:fill="F7FAFC" w:val="clear"/>
+            <w:tcMar>
+              <w:top w:type="dxa" w:w="100"/>
+              <w:left w:type="dxa" w:w="140"/>
+              <w:bottom w:type="dxa" w:w="100"/>
+              <w:right w:type="dxa" w:w="140"/>
+            </w:tcMar>
+          </w:tcPr>
+          <w:p>
+            <w:r>
+              <w:rPr>
+                <w:rFonts w:ascii="Times New Roman" w:cs="Times New Roman" w:eastAsia="Times New Roman" w:hAnsi="Times New Roman"/>
+                <w:color w:val="222222"/>
+                <w:sz w:val="21"/>
+                <w:szCs w:val="21"/>
+              </w:rPr>
+              <w:t xml:space="preserve">Amazon Simple Storage Service</w:t>
             </w:r>
           </w:p>
         </w:tc>
@@ -7525,35 +7580,35 @@
                 <w:sz w:val="21"/>
                 <w:szCs w:val="21"/>
               </w:rPr>
-              <w:t xml:space="preserve">SNS</w:t>
-            </w:r>
-          </w:p>
-        </w:tc>
-        <w:tc>
-          <w:tcPr>
-            <w:tcBorders>
-              <w:top w:val="single" w:color="CCCCCC" w:sz="2"/>
-              <w:left w:val="single" w:color="CCCCCC" w:sz="2"/>
-              <w:bottom w:val="single" w:color="CCCCCC" w:sz="2"/>
-              <w:right w:val="single" w:color="CCCCCC" w:sz="2"/>
-            </w:tcBorders>
-            <w:shd w:fill="FFFFFF" w:val="clear"/>
-            <w:tcMar>
-              <w:top w:type="dxa" w:w="100"/>
-              <w:left w:type="dxa" w:w="140"/>
-              <w:bottom w:type="dxa" w:w="100"/>
-              <w:right w:type="dxa" w:w="140"/>
-            </w:tcMar>
-          </w:tcPr>
-          <w:p>
-            <w:r>
-              <w:rPr>
-                <w:rFonts w:ascii="Times New Roman" w:cs="Times New Roman" w:eastAsia="Times New Roman" w:hAnsi="Times New Roman"/>
-                <w:color w:val="222222"/>
-                <w:sz w:val="21"/>
-                <w:szCs w:val="21"/>
-              </w:rPr>
-              <w:t xml:space="preserve">Amazon Simple Notification Service</w:t>
+              <w:t xml:space="preserve">SDG</w:t>
+            </w:r>
+          </w:p>
+        </w:tc>
+        <w:tc>
+          <w:tcPr>
+            <w:tcBorders>
+              <w:top w:val="single" w:color="CCCCCC" w:sz="2"/>
+              <w:left w:val="single" w:color="CCCCCC" w:sz="2"/>
+              <w:bottom w:val="single" w:color="CCCCCC" w:sz="2"/>
+              <w:right w:val="single" w:color="CCCCCC" w:sz="2"/>
+            </w:tcBorders>
+            <w:shd w:fill="FFFFFF" w:val="clear"/>
+            <w:tcMar>
+              <w:top w:type="dxa" w:w="100"/>
+              <w:left w:type="dxa" w:w="140"/>
+              <w:bottom w:type="dxa" w:w="100"/>
+              <w:right w:type="dxa" w:w="140"/>
+            </w:tcMar>
+          </w:tcPr>
+          <w:p>
+            <w:r>
+              <w:rPr>
+                <w:rFonts w:ascii="Times New Roman" w:cs="Times New Roman" w:eastAsia="Times New Roman" w:hAnsi="Times New Roman"/>
+                <w:color w:val="222222"/>
+                <w:sz w:val="21"/>
+                <w:szCs w:val="21"/>
+              </w:rPr>
+              <w:t xml:space="preserve">Sustainable Development Goal</w:t>
             </w:r>
           </w:p>
         </w:tc>
@@ -7583,35 +7638,35 @@
                 <w:sz w:val="21"/>
                 <w:szCs w:val="21"/>
               </w:rPr>
-              <w:t xml:space="preserve">SPA</w:t>
-            </w:r>
-          </w:p>
-        </w:tc>
-        <w:tc>
-          <w:tcPr>
-            <w:tcBorders>
-              <w:top w:val="single" w:color="CCCCCC" w:sz="2"/>
-              <w:left w:val="single" w:color="CCCCCC" w:sz="2"/>
-              <w:bottom w:val="single" w:color="CCCCCC" w:sz="2"/>
-              <w:right w:val="single" w:color="CCCCCC" w:sz="2"/>
-            </w:tcBorders>
-            <w:shd w:fill="F7FAFC" w:val="clear"/>
-            <w:tcMar>
-              <w:top w:type="dxa" w:w="100"/>
-              <w:left w:type="dxa" w:w="140"/>
-              <w:bottom w:type="dxa" w:w="100"/>
-              <w:right w:type="dxa" w:w="140"/>
-            </w:tcMar>
-          </w:tcPr>
-          <w:p>
-            <w:r>
-              <w:rPr>
-                <w:rFonts w:ascii="Times New Roman" w:cs="Times New Roman" w:eastAsia="Times New Roman" w:hAnsi="Times New Roman"/>
-                <w:color w:val="222222"/>
-                <w:sz w:val="21"/>
-                <w:szCs w:val="21"/>
-              </w:rPr>
-              <w:t xml:space="preserve">Single Page Application (React)</w:t>
+              <w:t xml:space="preserve">SNS</w:t>
+            </w:r>
+          </w:p>
+        </w:tc>
+        <w:tc>
+          <w:tcPr>
+            <w:tcBorders>
+              <w:top w:val="single" w:color="CCCCCC" w:sz="2"/>
+              <w:left w:val="single" w:color="CCCCCC" w:sz="2"/>
+              <w:bottom w:val="single" w:color="CCCCCC" w:sz="2"/>
+              <w:right w:val="single" w:color="CCCCCC" w:sz="2"/>
+            </w:tcBorders>
+            <w:shd w:fill="F7FAFC" w:val="clear"/>
+            <w:tcMar>
+              <w:top w:type="dxa" w:w="100"/>
+              <w:left w:type="dxa" w:w="140"/>
+              <w:bottom w:type="dxa" w:w="100"/>
+              <w:right w:type="dxa" w:w="140"/>
+            </w:tcMar>
+          </w:tcPr>
+          <w:p>
+            <w:r>
+              <w:rPr>
+                <w:rFonts w:ascii="Times New Roman" w:cs="Times New Roman" w:eastAsia="Times New Roman" w:hAnsi="Times New Roman"/>
+                <w:color w:val="222222"/>
+                <w:sz w:val="21"/>
+                <w:szCs w:val="21"/>
+              </w:rPr>
+              <w:t xml:space="preserve">Amazon Simple Notification Service</w:t>
             </w:r>
           </w:p>
         </w:tc>
@@ -7641,35 +7696,35 @@
                 <w:sz w:val="21"/>
                 <w:szCs w:val="21"/>
               </w:rPr>
-              <w:t xml:space="preserve">SRP</w:t>
-            </w:r>
-          </w:p>
-        </w:tc>
-        <w:tc>
-          <w:tcPr>
-            <w:tcBorders>
-              <w:top w:val="single" w:color="CCCCCC" w:sz="2"/>
-              <w:left w:val="single" w:color="CCCCCC" w:sz="2"/>
-              <w:bottom w:val="single" w:color="CCCCCC" w:sz="2"/>
-              <w:right w:val="single" w:color="CCCCCC" w:sz="2"/>
-            </w:tcBorders>
-            <w:shd w:fill="FFFFFF" w:val="clear"/>
-            <w:tcMar>
-              <w:top w:type="dxa" w:w="100"/>
-              <w:left w:type="dxa" w:w="140"/>
-              <w:bottom w:type="dxa" w:w="100"/>
-              <w:right w:type="dxa" w:w="140"/>
-            </w:tcMar>
-          </w:tcPr>
-          <w:p>
-            <w:r>
-              <w:rPr>
-                <w:rFonts w:ascii="Times New Roman" w:cs="Times New Roman" w:eastAsia="Times New Roman" w:hAnsi="Times New Roman"/>
-                <w:color w:val="222222"/>
-                <w:sz w:val="21"/>
-                <w:szCs w:val="21"/>
-              </w:rPr>
-              <w:t xml:space="preserve">Secure Remote Password Protocol</w:t>
+              <w:t xml:space="preserve">SPA</w:t>
+            </w:r>
+          </w:p>
+        </w:tc>
+        <w:tc>
+          <w:tcPr>
+            <w:tcBorders>
+              <w:top w:val="single" w:color="CCCCCC" w:sz="2"/>
+              <w:left w:val="single" w:color="CCCCCC" w:sz="2"/>
+              <w:bottom w:val="single" w:color="CCCCCC" w:sz="2"/>
+              <w:right w:val="single" w:color="CCCCCC" w:sz="2"/>
+            </w:tcBorders>
+            <w:shd w:fill="FFFFFF" w:val="clear"/>
+            <w:tcMar>
+              <w:top w:type="dxa" w:w="100"/>
+              <w:left w:type="dxa" w:w="140"/>
+              <w:bottom w:type="dxa" w:w="100"/>
+              <w:right w:type="dxa" w:w="140"/>
+            </w:tcMar>
+          </w:tcPr>
+          <w:p>
+            <w:r>
+              <w:rPr>
+                <w:rFonts w:ascii="Times New Roman" w:cs="Times New Roman" w:eastAsia="Times New Roman" w:hAnsi="Times New Roman"/>
+                <w:color w:val="222222"/>
+                <w:sz w:val="21"/>
+                <w:szCs w:val="21"/>
+              </w:rPr>
+              <w:t xml:space="preserve">Single Page Application (React)</w:t>
             </w:r>
           </w:p>
         </w:tc>
@@ -7699,6 +7754,64 @@
                 <w:sz w:val="21"/>
                 <w:szCs w:val="21"/>
               </w:rPr>
+              <w:t xml:space="preserve">SRP</w:t>
+            </w:r>
+          </w:p>
+        </w:tc>
+        <w:tc>
+          <w:tcPr>
+            <w:tcBorders>
+              <w:top w:val="single" w:color="CCCCCC" w:sz="2"/>
+              <w:left w:val="single" w:color="CCCCCC" w:sz="2"/>
+              <w:bottom w:val="single" w:color="CCCCCC" w:sz="2"/>
+              <w:right w:val="single" w:color="CCCCCC" w:sz="2"/>
+            </w:tcBorders>
+            <w:shd w:fill="F7FAFC" w:val="clear"/>
+            <w:tcMar>
+              <w:top w:type="dxa" w:w="100"/>
+              <w:left w:type="dxa" w:w="140"/>
+              <w:bottom w:type="dxa" w:w="100"/>
+              <w:right w:type="dxa" w:w="140"/>
+            </w:tcMar>
+          </w:tcPr>
+          <w:p>
+            <w:r>
+              <w:rPr>
+                <w:rFonts w:ascii="Times New Roman" w:cs="Times New Roman" w:eastAsia="Times New Roman" w:hAnsi="Times New Roman"/>
+                <w:color w:val="222222"/>
+                <w:sz w:val="21"/>
+                <w:szCs w:val="21"/>
+              </w:rPr>
+              <w:t xml:space="preserve">Secure Remote Password Protocol</w:t>
+            </w:r>
+          </w:p>
+        </w:tc>
+      </w:tr>
+      <w:tr>
+        <w:tc>
+          <w:tcPr>
+            <w:tcBorders>
+              <w:top w:val="single" w:color="CCCCCC" w:sz="2"/>
+              <w:left w:val="single" w:color="CCCCCC" w:sz="2"/>
+              <w:bottom w:val="single" w:color="CCCCCC" w:sz="2"/>
+              <w:right w:val="single" w:color="CCCCCC" w:sz="2"/>
+            </w:tcBorders>
+            <w:shd w:fill="FFFFFF" w:val="clear"/>
+            <w:tcMar>
+              <w:top w:type="dxa" w:w="100"/>
+              <w:left w:type="dxa" w:w="140"/>
+              <w:bottom w:type="dxa" w:w="100"/>
+              <w:right w:type="dxa" w:w="140"/>
+            </w:tcMar>
+          </w:tcPr>
+          <w:p>
+            <w:r>
+              <w:rPr>
+                <w:rFonts w:ascii="Times New Roman" w:cs="Times New Roman" w:eastAsia="Times New Roman" w:hAnsi="Times New Roman"/>
+                <w:color w:val="222222"/>
+                <w:sz w:val="21"/>
+                <w:szCs w:val="21"/>
+              </w:rPr>
               <w:t xml:space="preserve">UI / UX</w:t>
             </w:r>
           </w:p>
@@ -7711,7 +7824,7 @@
               <w:bottom w:val="single" w:color="CCCCCC" w:sz="2"/>
               <w:right w:val="single" w:color="CCCCCC" w:sz="2"/>
             </w:tcBorders>
-            <w:shd w:fill="F7FAFC" w:val="clear"/>
+            <w:shd w:fill="FFFFFF" w:val="clear"/>
             <w:tcMar>
               <w:top w:type="dxa" w:w="100"/>
               <w:left w:type="dxa" w:w="140"/>
@@ -7790,7 +7903,7 @@
           <w:sz w:val="24"/>
           <w:szCs w:val="24"/>
         </w:rPr>
-        <w:t xml:space="preserve">Presently is a production-ready, cloud-native biometric attendance and classroom management platform architected exclusively for higher education institutions. The system combines modern serverless cloud engineering with computer vision AI to automate classroom management, eliminate proxy attendance, and streamline faculty administrative workflows.</w:t>
+        <w:t xml:space="preserve">Presently is a production-ready, cloud-native biometric attendance and classroom management platform architected for higher education institutions as part of the Cloud Strategy Planning and Management course (21CSE463T). The system combines modern serverless cloud engineering with computer vision AI to automate classroom management, eliminate proxy attendance, and streamline faculty administrative workflows.</w:t>
       </w:r>
     </w:p>
     <w:p>
@@ -8055,7 +8168,7 @@
           <w:sz w:val="28"/>
           <w:szCs w:val="28"/>
         </w:rPr>
-        <w:t xml:space="preserve">1.3 Motivation</w:t>
+        <w:t xml:space="preserve">1.3 Motivation &amp; Cloud Strategy Alignment</w:t>
       </w:r>
     </w:p>
     <w:p>
@@ -8074,7 +8187,7 @@
           <w:sz w:val="24"/>
           <w:szCs w:val="24"/>
         </w:rPr>
-        <w:t xml:space="preserve">The motivation behind Presently is to engineer an accessible, hardware-free, zero-idle-cost attendance management platform utilizing modern serverless cloud infrastructure and browser-native computer vision. By leveraging Amazon Rekognition’s cloud-scale neural vision models directly from standard webcams and laptops, educational institutions can enforce strict biometric verification without purchasing proprietary hardware.</w:t>
+        <w:t xml:space="preserve">In alignment with the curriculum of Cloud Strategy Planning and Management (21CSE463T), Presently demonstrates how a modern cloud strategy can replace capital-intensive on-premise hardware with elastic, cost-optimized serverless architectures. By leveraging Amazon Rekognition’s cloud-scale neural vision models directly from standard webcams and laptops, educational institutions can enforce strict biometric verification without purchasing proprietary hardware.</w:t>
       </w:r>
     </w:p>
     <w:p>
@@ -14558,7 +14671,7 @@
           <w:sz w:val="24"/>
           <w:szCs w:val="24"/>
         </w:rPr>
-        <w:t xml:space="preserve">This report presented Presently, an AWS Serverless AI Facial Recognition Attendance and Classroom Management Platform engineered for higher education. By unifying Amazon Rekognition, AWS Lambda, DynamoDB, Cognito, and CloudFront with Terraform IaC, the platform successfully solves the challenges of proxy attendance, administrative overhead, and high hardware costs while operating at zero idle cost on AWS Free Tier.</w:t>
+        <w:t xml:space="preserve">This report presented Presently, an AWS Serverless AI Facial Recognition Attendance and Classroom Management Platform engineered for higher education and submitted for Cloud Strategy Planning and Management (21CSE463T). By unifying Amazon Rekognition, AWS Lambda, DynamoDB, Cognito, and CloudFront with Terraform IaC, the platform successfully solves the challenges of proxy attendance, administrative overhead, and high hardware costs while operating at zero idle cost on AWS Free Tier.</w:t>
       </w:r>
     </w:p>
     <w:p>
@@ -14845,12 +14958,12 @@
           <w:sz w:val="24"/>
           <w:szCs w:val="24"/>
         </w:rPr>
-        <w:t xml:space="preserve">We hereby declare that this project report titled “Presently: An AWS Serverless AI Facial Recognition Attendance and Classroom Management Platform for Higher Education” has been carried out by us in partial fulfillment of the requirements for the award of the degree of Bachelor of Technology in Computer Science and Engineering at SRM Institute of Science and Technology, Kattankulathur, Tamil Nadu, India.</w:t>
+        <w:t xml:space="preserve">I hereby declare that this project report titled “Presently: An AWS Serverless AI Facial Recognition Attendance and Classroom Management Platform for Higher Education” has been carried out by me in partial fulfillment of the requirements for the course Cloud Strategy Planning and Management (21CSE463T) for the award of the degree of Bachelor of Technology in Computer Science and Engineering at SRM Institute of Science and Technology, Kattankulathur, Tamil Nadu, India.</w:t>
       </w:r>
     </w:p>
     <w:p>
       <w:pPr>
-        <w:spacing w:after="160" w:before="80" w:line="276"/>
+        <w:spacing w:after="200" w:before="80" w:line="276"/>
         <w:jc w:val="left"/>
       </w:pPr>
       <w:r>
@@ -14864,53 +14977,9 @@
           <w:sz w:val="24"/>
           <w:szCs w:val="24"/>
         </w:rPr>
-        <w:t xml:space="preserve">Student 1 Signature: ___________________
+        <w:t xml:space="preserve">Student Signature: ___________________
 Name: Sahil Moghaiz
 Reg. No.: RA2311028010062
-Date: May 15, 2026</w:t>
-      </w:r>
-    </w:p>
-    <w:p>
-      <w:pPr>
-        <w:spacing w:after="160" w:before="80" w:line="276"/>
-        <w:jc w:val="left"/>
-      </w:pPr>
-      <w:r>
-        <w:rPr>
-          <w:rFonts w:ascii="Times New Roman" w:cs="Times New Roman" w:eastAsia="Times New Roman" w:hAnsi="Times New Roman"/>
-          <w:b w:val="false"/>
-          <w:bCs w:val="false"/>
-          <w:i w:val="false"/>
-          <w:iCs w:val="false"/>
-          <w:color w:val="222222"/>
-          <w:sz w:val="24"/>
-          <w:szCs w:val="24"/>
-        </w:rPr>
-        <w:t xml:space="preserve">Student 2 Signature: ___________________
-Name: Tanmay Shrivastava
-Reg. No.: RA2311028010082
-Date: May 15, 2026</w:t>
-      </w:r>
-    </w:p>
-    <w:p>
-      <w:pPr>
-        <w:spacing w:after="200" w:before="80" w:line="276"/>
-        <w:jc w:val="left"/>
-      </w:pPr>
-      <w:r>
-        <w:rPr>
-          <w:rFonts w:ascii="Times New Roman" w:cs="Times New Roman" w:eastAsia="Times New Roman" w:hAnsi="Times New Roman"/>
-          <w:b w:val="false"/>
-          <w:bCs w:val="false"/>
-          <w:i w:val="false"/>
-          <w:iCs w:val="false"/>
-          <w:color w:val="222222"/>
-          <w:sz w:val="24"/>
-          <w:szCs w:val="24"/>
-        </w:rPr>
-        <w:t xml:space="preserve">Student 3 Signature: ___________________
-Name: Nishchal Mahant
-Reg. No.: RA2311028010077
 Date: May 15, 2026</w:t>
       </w:r>
     </w:p>
@@ -14931,8 +15000,8 @@
           <w:szCs w:val="24"/>
         </w:rPr>
         <w:t xml:space="preserve">Guide Signature: ___________________________
-Name: Dr. S. Benisha
-Designation: Assistant Professor, Department of Networking and Communication
+Name: Dr. S. Prabakeran
+Designation: Professor, Department of Networking and Communication
 Date: May 15, 2026</w:t>
       </w:r>
     </w:p>
@@ -15091,7 +15160,7 @@
         <w:sz w:val="18"/>
         <w:szCs w:val="18"/>
       </w:rPr>
-      <w:t xml:space="preserve">Presently: AWS Serverless AI Attendance Platform | 21CSP302L</w:t>
+      <w:t xml:space="preserve">Presently: AWS Serverless AI Attendance Platform | 21CSE463T</w:t>
     </w:r>
   </w:p>
 </w:hdr>

</xml_diff>